<commit_message>
Guide: update example folder paths to Easy-build-RTnode-2400 (match renamed repo)
Co-Authored-By: Claude Opus 4.8 <noreply@anthropic.com>
</commit_message>
<xml_diff>
--- a/RTNode2400_Build_Guide.docx
+++ b/RTNode2400_Build_Guide.docx
@@ -579,7 +579,7 @@
           <w:sz w:val="20"/>
           <w:szCs w:val="20"/>
         </w:rPr>
-        <w:t xml:space="preserve">bash ~/Downloads/Easy-Reticulum-Transport-Node-Build/setup_rtnode2400.sh</w:t>
+        <w:t xml:space="preserve">bash ~/Downloads/Easy-build-RTnode-2400/setup_rtnode2400.sh</w:t>
       </w:r>
     </w:p>
     <w:p>
@@ -3955,7 +3955,7 @@
           <w:sz w:val="20"/>
           <w:szCs w:val="20"/>
         </w:rPr>
-        <w:t xml:space="preserve">cd ~/Downloads/Easy-Reticulum-Transport-Node-Build</w:t>
+        <w:t xml:space="preserve">cd ~/Downloads/Easy-build-RTnode-2400</w:t>
       </w:r>
     </w:p>
     <w:p>

</xml_diff>